<commit_message>
Estende procuracao a todas as UCs vinculadas ao CPF do outorgante
Substitui o campo em branco de unidades consumidoras por clausula
expressa abrangendo todas as UCs cadastradas sob o CPF do outorgante
na Equatorial Maranhao, existentes e futuras, em qualquer municipio
do estado e em qualquer classe de consumo. Acrescenta clausula
autorizando a concessionaria a identificar essas UCs pelo cadastro
interno e a prestar as informacoes ao outorgado.

Co-Authored-By: Claude Opus 5 <noreply@anthropic.com>
Claude-Session: https://claude.ai/code/session_01Dv7uD5amCn6WGi4EMtHcum
</commit_message>
<xml_diff>
--- a/documentos/Procuracao-Equatorial-Maranhao.docx
+++ b/documentos/Procuracao-Equatorial-Maranhao.docx
@@ -129,26 +129,26 @@
           <w:sz w:val="24"/>
           <w:szCs w:val="24"/>
         </w:rPr>
-        <w:t xml:space="preserve">Pelo presente instrumento particular de procuração, o OUTORGANTE nomeia e constitui seu bastante procurador o OUTORGADO acima qualificado, a quem confere amplos, gerais e ilimitados poderes para representá-lo perante a EQUATORIAL MARANHÃO DISTRIBUIDORA DE ENERGIA S.A. — Equatorial Energia Maranhão — e suas empresas coligadas, controladas ou sucessoras, a fim de tratar, requerer, acompanhar e resolver todo e qualquer problema, assunto, solicitação ou pendência relativos ao fornecimento de energia elétrica das unidades consumidoras de titularidade ou interesse do OUTORGANTE, podendo, especialmente, mas sem caráter limitativo:</w:t>
-      </w:r>
-    </w:p>
-    <w:p>
-      <w:pPr>
-        <w:pStyle w:val="ListParagraph"/>
-        <w:numPr>
-          <w:ilvl w:val="0"/>
-          <w:numId w:val="2"/>
-        </w:numPr>
-        <w:spacing w:after="100" w:line="280"/>
-        <w:jc w:val="both"/>
-      </w:pPr>
-      <w:r>
-        <w:rPr>
-          <w:rFonts w:ascii="Times New Roman" w:cs="Times New Roman" w:eastAsia="Times New Roman" w:hAnsi="Times New Roman"/>
-          <w:sz w:val="24"/>
-          <w:szCs w:val="24"/>
-        </w:rPr>
-        <w:t xml:space="preserve">Representar o OUTORGANTE, em caráter amplo e geral, perante a EQUATORIAL MARANHÃO DISTRIBUIDORA DE ENERGIA S.A. (Equatorial Energia Maranhão), em quaisquer de seus canais de atendimento — agências de atendimento presencial, postos credenciados, agência virtual/web, aplicativo, central de relacionamento (116), atendimento por WhatsApp e Ouvidoria — para tratar e resolver todo e qualquer assunto, problema ou pendência relacionados às unidades consumidoras de titularidade ou interesse do OUTORGANTE.</w:t>
+        <w:t xml:space="preserve">Pelo presente instrumento particular de procuração, o OUTORGANTE nomeia e constitui seu bastante procurador o OUTORGADO acima qualificado, a quem confere amplos, gerais e ilimitados poderes para representá-lo perante a EQUATORIAL MARANHÃO DISTRIBUIDORA DE ENERGIA S.A. — Equatorial Energia Maranhão — e suas empresas coligadas, controladas ou sucessoras, a fim de tratar, requerer, acompanhar e resolver todo e qualquer problema, assunto, solicitação ou pendência relativos ao fornecimento de energia elétrica de TODAS as unidades consumidoras cadastradas sob o CPF nº 055.489.003-82 do OUTORGANTE, existentes ou futuras, em qualquer município do Estado do Maranhão, podendo, especialmente, mas sem caráter limitativo:</w:t>
+      </w:r>
+    </w:p>
+    <w:p>
+      <w:pPr>
+        <w:pStyle w:val="ListParagraph"/>
+        <w:numPr>
+          <w:ilvl w:val="0"/>
+          <w:numId w:val="2"/>
+        </w:numPr>
+        <w:spacing w:after="100" w:line="280"/>
+        <w:jc w:val="both"/>
+      </w:pPr>
+      <w:r>
+        <w:rPr>
+          <w:rFonts w:ascii="Times New Roman" w:cs="Times New Roman" w:eastAsia="Times New Roman" w:hAnsi="Times New Roman"/>
+          <w:sz w:val="24"/>
+          <w:szCs w:val="24"/>
+        </w:rPr>
+        <w:t xml:space="preserve">Representar o OUTORGANTE, em caráter amplo e geral, perante a EQUATORIAL MARANHÃO DISTRIBUIDORA DE ENERGIA S.A. (Equatorial Energia Maranhão), em quaisquer de seus canais de atendimento — agências de atendimento presencial, postos credenciados, agência virtual/web, aplicativo, central de relacionamento (116), atendimento por WhatsApp e Ouvidoria — para tratar e resolver todo e qualquer assunto, problema ou pendência relacionados a todas as unidades consumidoras cadastradas sob o CPF do OUTORGANTE.</w:t>
       </w:r>
     </w:p>
     <w:p>
@@ -635,7 +635,21 @@
           <w:sz w:val="24"/>
           <w:szCs w:val="24"/>
         </w:rPr>
-        <w:t xml:space="preserve">5. Unidade(s) consumidora(s) abrangida(s) por este mandato: ______________________________________________ ________________________________________________________________________________________ (quando não preenchido este campo, o mandato alcança todas as unidades consumidoras de titularidade ou interesse do OUTORGANTE).</w:t>
+        <w:t xml:space="preserve">5. O presente mandato abrange, sem exceção, TODAS as unidades consumidoras cadastradas na Equatorial Maranhão em nome e sob o CPF nº 055.489.003-82 do OUTORGANTE, em qualquer município do Estado do Maranhão, sejam elas urbanas ou rurais, de qualquer classe ou subclasse de consumo — residencial, comercial, industrial, rural, poder público ou serviço público —, independentemente do número da unidade consumidora, do número da conta contrato ou do endereço de instalação, incluindo as existentes nesta data e as que venham a ser criadas, ligadas ou transferidas para a titularidade do OUTORGANTE durante a vigência desta procuração.</w:t>
+      </w:r>
+    </w:p>
+    <w:p>
+      <w:pPr>
+        <w:spacing w:after="180" w:line="300"/>
+        <w:jc w:val="both"/>
+      </w:pPr>
+      <w:r>
+        <w:rPr>
+          <w:rFonts w:ascii="Times New Roman" w:cs="Times New Roman" w:eastAsia="Times New Roman" w:hAnsi="Times New Roman"/>
+          <w:sz w:val="24"/>
+          <w:szCs w:val="24"/>
+        </w:rPr>
+        <w:t xml:space="preserve">6. Fica a concessionária expressamente autorizada a identificar e listar, por meio de seu cadastro interno, todas as unidades consumidoras vinculadas ao CPF do OUTORGANTE, bem como a prestar ao OUTORGADO todas as informações a elas referentes, ficando o OUTORGADO autorizado a acessá-las e a movimentá-las nos termos dos poderes acima conferidos.</w:t>
       </w:r>
     </w:p>
     <w:p>

</xml_diff>